<commit_message>
docs: remove obsolete IT-029-002 roadmap reference
</commit_message>
<xml_diff>
--- a/docs/IT-029-001 — Decision Proposal Domain Model MVP.docx
+++ b/docs/IT-029-001 — Decision Proposal Domain Model MVP.docx
@@ -10845,36 +10845,31 @@
         <w:rPr>
           <w:rtl w:val="0"/>
         </w:rPr>
-        <w:t xml:space="preserve">La aprobación del presente incremento autoriza exclusivamente el inicio de:</w:t>
-      </w:r>
-    </w:p>
-    <w:p>
-      <w:pPr>
-        <w:spacing w:after="240" w:before="240" w:lineRule="auto"/>
-        <w:rPr>
-          <w:b w:val="1"/>
-          <w:bCs w:val="1"/>
-        </w:rPr>
-      </w:pPr>
-      <w:r>
-        <w:rPr>
-          <w:b w:val="1"/>
-          <w:bCs w:val="1"/>
-          <w:rtl w:val="0"/>
-        </w:rPr>
-        <w:t xml:space="preserve">IT-029-002 — Decision Proposal Formulation MVP</w:t>
-      </w:r>
-    </w:p>
-    <w:p>
-      <w:pPr>
-        <w:spacing w:after="240" w:before="240" w:lineRule="auto"/>
-        <w:rPr/>
-      </w:pPr>
-      <w:r>
-        <w:rPr>
-          <w:rtl w:val="0"/>
-        </w:rPr>
-        <w:t xml:space="preserve">Ningún incremento posterior podrá modificar:</w:t>
+        <w:t xml:space="preserve">La aprobación del presente incremento concluye la implementación del primer activo público de la Capability Decision Model. </w:t>
+      </w:r>
+    </w:p>
+    <w:p>
+      <w:pPr>
+        <w:spacing w:after="240" w:before="240" w:lineRule="auto"/>
+        <w:rPr/>
+      </w:pPr>
+      <w:r>
+        <w:rPr>
+          <w:rtl w:val="0"/>
+        </w:rPr>
+        <w:t xml:space="preserve">Los incrementos posteriores que consuman la DecisionProposal deberán definirse conforme a la arquitectura vigente y a las responsabilidades arquitectónicas emergentes determinadas mediante DOC-028.</w:t>
+      </w:r>
+    </w:p>
+    <w:p>
+      <w:pPr>
+        <w:spacing w:after="240" w:before="240" w:lineRule="auto"/>
+        <w:rPr/>
+      </w:pPr>
+      <w:r>
+        <w:rPr>
+          <w:rtl w:val="0"/>
+        </w:rPr>
+        <w:t xml:space="preserve"> Ningún incremento posterior podrá modificar:</w:t>
       </w:r>
     </w:p>
     <w:p>
@@ -10885,12 +10880,15 @@
         </w:numPr>
         <w:spacing w:after="0" w:afterAutospacing="0" w:before="240" w:lineRule="auto"/>
         <w:ind w:left="720" w:hanging="360"/>
-      </w:pPr>
-      <w:r>
-        <w:rPr>
-          <w:rtl w:val="0"/>
-        </w:rPr>
-        <w:t xml:space="preserve">la identidad arquitectónica;</w:t>
+        <w:rPr>
+          <w:u w:val="none"/>
+        </w:rPr>
+      </w:pPr>
+      <w:r>
+        <w:rPr>
+          <w:rtl w:val="0"/>
+        </w:rPr>
+        <w:t xml:space="preserve">  la identidad arquitectónica;</w:t>
       </w:r>
     </w:p>
     <w:p>
@@ -10901,12 +10899,15 @@
         </w:numPr>
         <w:spacing w:after="0" w:afterAutospacing="0" w:before="0" w:beforeAutospacing="0" w:lineRule="auto"/>
         <w:ind w:left="720" w:hanging="360"/>
-      </w:pPr>
-      <w:r>
-        <w:rPr>
-          <w:rtl w:val="0"/>
-        </w:rPr>
-        <w:t xml:space="preserve">la semántica;</w:t>
+        <w:rPr>
+          <w:u w:val="none"/>
+        </w:rPr>
+      </w:pPr>
+      <w:r>
+        <w:rPr>
+          <w:rtl w:val="0"/>
+        </w:rPr>
+        <w:t xml:space="preserve">  la semántica;</w:t>
       </w:r>
     </w:p>
     <w:p>
@@ -10917,12 +10918,15 @@
         </w:numPr>
         <w:spacing w:after="0" w:afterAutospacing="0" w:before="0" w:beforeAutospacing="0" w:lineRule="auto"/>
         <w:ind w:left="720" w:hanging="360"/>
-      </w:pPr>
-      <w:r>
-        <w:rPr>
-          <w:rtl w:val="0"/>
-        </w:rPr>
-        <w:t xml:space="preserve">la naturaleza del activo;</w:t>
+        <w:rPr>
+          <w:u w:val="none"/>
+        </w:rPr>
+      </w:pPr>
+      <w:r>
+        <w:rPr>
+          <w:rtl w:val="0"/>
+        </w:rPr>
+        <w:t xml:space="preserve">  la naturaleza del activo;</w:t>
       </w:r>
     </w:p>
     <w:p>
@@ -10933,12 +10937,15 @@
         </w:numPr>
         <w:spacing w:after="0" w:afterAutospacing="0" w:before="0" w:beforeAutospacing="0" w:lineRule="auto"/>
         <w:ind w:left="720" w:hanging="360"/>
-      </w:pPr>
-      <w:r>
-        <w:rPr>
-          <w:rtl w:val="0"/>
-        </w:rPr>
-        <w:t xml:space="preserve">las invariantes;</w:t>
+        <w:rPr>
+          <w:u w:val="none"/>
+        </w:rPr>
+      </w:pPr>
+      <w:r>
+        <w:rPr>
+          <w:rtl w:val="0"/>
+        </w:rPr>
+        <w:t xml:space="preserve">   las invariantes;</w:t>
       </w:r>
     </w:p>
     <w:p>
@@ -10949,36 +10956,55 @@
         </w:numPr>
         <w:spacing w:after="240" w:before="0" w:beforeAutospacing="0" w:lineRule="auto"/>
         <w:ind w:left="720" w:hanging="360"/>
-      </w:pPr>
-      <w:r>
-        <w:rPr>
-          <w:rtl w:val="0"/>
-        </w:rPr>
-        <w:t xml:space="preserve">las fronteras arquitectónicas;</w:t>
-      </w:r>
-    </w:p>
-    <w:p>
-      <w:pPr>
-        <w:spacing w:after="240" w:before="240" w:lineRule="auto"/>
-        <w:rPr/>
-      </w:pPr>
-      <w:r>
-        <w:rPr>
-          <w:rtl w:val="0"/>
-        </w:rPr>
-        <w:t xml:space="preserve">establecidas por IT-029-001.</w:t>
-      </w:r>
-    </w:p>
-    <w:p>
-      <w:pPr>
-        <w:spacing w:after="240" w:before="240" w:lineRule="auto"/>
-        <w:rPr/>
-      </w:pPr>
-      <w:r>
-        <w:rPr>
-          <w:rtl w:val="0"/>
-        </w:rPr>
-        <w:t xml:space="preserve">Toda evolución futura deberá construir nuevas responsabilidades preservando íntegramente el modelo de dominio aprobado.</w:t>
+        <w:rPr>
+          <w:u w:val="none"/>
+        </w:rPr>
+      </w:pPr>
+      <w:r>
+        <w:rPr>
+          <w:rtl w:val="0"/>
+        </w:rPr>
+        <w:t xml:space="preserve">    las fronteras arquitectónicas;</w:t>
+      </w:r>
+    </w:p>
+    <w:p>
+      <w:pPr>
+        <w:spacing w:after="240" w:before="240" w:lineRule="auto"/>
+        <w:rPr/>
+      </w:pPr>
+      <w:r>
+        <w:rPr>
+          <w:rtl w:val="0"/>
+        </w:rPr>
+        <w:t xml:space="preserve">   establecidas por IT-029-001. </w:t>
+      </w:r>
+    </w:p>
+    <w:p>
+      <w:pPr>
+        <w:spacing w:after="240" w:before="240" w:lineRule="auto"/>
+        <w:rPr/>
+      </w:pPr>
+      <w:r>
+        <w:rPr>
+          <w:rtl w:val="0"/>
+        </w:rPr>
+      </w:r>
+    </w:p>
+    <w:p>
+      <w:pPr>
+        <w:spacing w:after="240" w:before="240" w:lineRule="auto"/>
+        <w:rPr/>
+      </w:pPr>
+      <w:r>
+        <w:rPr>
+          <w:rtl w:val="0"/>
+        </w:rPr>
+        <w:t xml:space="preserve">Toda evolución futura deberá preservar íntegramente el modelo de dominio aprobado y construir nuevas responsabilidades sobre dicho contrato público, sin alterar su identidad arquitectónica. </w:t>
+      </w:r>
+      <w:r>
+        <w:rPr>
+          <w:rtl w:val="0"/>
+        </w:rPr>
       </w:r>
     </w:p>
     <w:p>

</xml_diff>